<commit_message>
Add direct hash routing for individual project live demos
</commit_message>
<xml_diff>
--- a/Sricharan_Surakanti_Resume.docx
+++ b/Sricharan_Surakanti_Resume.docx
@@ -664,7 +664,7 @@
               </w:rPr>
               <w:t>]  [</w:t>
             </w:r>
-            <w:hyperlink r:id="rId14">
+            <w:hyperlink r:id="rId16">
               <w:r>
                 <w:rPr>
                   <w:rFonts w:ascii="Calibri" w:hAnsi="Calibri"/>
@@ -774,7 +774,7 @@
               </w:rPr>
               <w:t>[</w:t>
             </w:r>
-            <w:hyperlink r:id="rId16">
+            <w:hyperlink r:id="rId17">
               <w:r>
                 <w:rPr>
                   <w:rFonts w:ascii="Calibri" w:hAnsi="Calibri"/>
@@ -793,7 +793,7 @@
               </w:rPr>
               <w:t>]  [</w:t>
             </w:r>
-            <w:hyperlink r:id="rId14">
+            <w:hyperlink r:id="rId18">
               <w:r>
                 <w:rPr>
                   <w:rFonts w:ascii="Calibri" w:hAnsi="Calibri"/>

</xml_diff>

<commit_message>
Swap Education up and Skills down, set bold black headings
</commit_message>
<xml_diff>
--- a/Sricharan_Surakanti_Resume.docx
+++ b/Sricharan_Surakanti_Resume.docx
@@ -100,7 +100,7 @@
       <w:pPr>
         <w:spacing w:before="100" w:after="40"/>
         <w:pBdr>
-          <w:bottom w:val="single" w:sz="6" w:space="1" w:color="111827"/>
+          <w:bottom w:val="single" w:sz="6" w:space="1" w:color="000000"/>
         </w:pBdr>
       </w:pPr>
       <w:r>
@@ -108,7 +108,7 @@
           <w:rFonts w:ascii="Calibri" w:hAnsi="Calibri"/>
           <w:b/>
           <w:color w:val="000000"/>
-          <w:sz w:val="19"/>
+          <w:sz w:val="20"/>
         </w:rPr>
         <w:t>PROFESSIONAL SUMMARY</w:t>
       </w:r>
@@ -131,7 +131,7 @@
       <w:pPr>
         <w:spacing w:before="100" w:after="40"/>
         <w:pBdr>
-          <w:bottom w:val="single" w:sz="6" w:space="1" w:color="111827"/>
+          <w:bottom w:val="single" w:sz="6" w:space="1" w:color="000000"/>
         </w:pBdr>
       </w:pPr>
       <w:r>
@@ -139,108 +139,232 @@
           <w:rFonts w:ascii="Calibri" w:hAnsi="Calibri"/>
           <w:b/>
           <w:color w:val="000000"/>
-          <w:sz w:val="19"/>
+          <w:sz w:val="20"/>
         </w:rPr>
-        <w:t>TECHNICAL SKILLS</w:t>
+        <w:t>EDUCATION</w:t>
       </w:r>
     </w:p>
-    <w:p>
-      <w:pPr>
-        <w:spacing w:before="0" w:after="20"/>
-      </w:pPr>
-      <w:r>
-        <w:rPr>
-          <w:rFonts w:ascii="Calibri" w:hAnsi="Calibri"/>
-          <w:b/>
-          <w:color w:val="000000"/>
-          <w:sz w:val="17"/>
-        </w:rPr>
-        <w:t>Languages &amp; Core:</w:t>
-      </w:r>
-      <w:r>
-        <w:rPr>
-          <w:rFonts w:ascii="Calibri" w:hAnsi="Calibri"/>
-          <w:b w:val="0"/>
-          <w:color w:val="111827"/>
-          <w:sz w:val="17"/>
-        </w:rPr>
-        <w:t xml:space="preserve"> Python, Java, C/C++, SQL, Git, GitHub, RESTful APIs</w:t>
-      </w:r>
-    </w:p>
-    <w:p>
-      <w:pPr>
-        <w:spacing w:before="0" w:after="20"/>
-      </w:pPr>
-      <w:r>
-        <w:rPr>
-          <w:rFonts w:ascii="Calibri" w:hAnsi="Calibri"/>
-          <w:b/>
-          <w:color w:val="000000"/>
-          <w:sz w:val="17"/>
-        </w:rPr>
-        <w:t>Machine Learning &amp; DL:</w:t>
-      </w:r>
-      <w:r>
-        <w:rPr>
-          <w:rFonts w:ascii="Calibri" w:hAnsi="Calibri"/>
-          <w:b w:val="0"/>
-          <w:color w:val="111827"/>
-          <w:sz w:val="17"/>
-        </w:rPr>
-        <w:t xml:space="preserve"> PyTorch, TensorFlow, Keras, Scikit-Learn, BiLSTM, 1D-CNN, Ensembles, Predictive Analytics</w:t>
-      </w:r>
-    </w:p>
-    <w:p>
-      <w:pPr>
-        <w:spacing w:before="0" w:after="20"/>
-      </w:pPr>
-      <w:r>
-        <w:rPr>
-          <w:rFonts w:ascii="Calibri" w:hAnsi="Calibri"/>
-          <w:b/>
-          <w:color w:val="000000"/>
-          <w:sz w:val="17"/>
-        </w:rPr>
-        <w:t>NLP &amp; Text Forensics:</w:t>
-      </w:r>
-      <w:r>
-        <w:rPr>
-          <w:rFonts w:ascii="Calibri" w:hAnsi="Calibri"/>
-          <w:b w:val="0"/>
-          <w:color w:val="111827"/>
-          <w:sz w:val="17"/>
-        </w:rPr>
-        <w:t xml:space="preserve"> NLTK, TF-IDF, Tokenization, Lemmatization, Sentiment Analysis, Text Mining, Keyword Extraction</w:t>
-      </w:r>
-    </w:p>
-    <w:p>
-      <w:pPr>
-        <w:spacing w:before="0" w:after="20"/>
-      </w:pPr>
-      <w:r>
-        <w:rPr>
-          <w:rFonts w:ascii="Calibri" w:hAnsi="Calibri"/>
-          <w:b/>
-          <w:color w:val="000000"/>
-          <w:sz w:val="17"/>
-        </w:rPr>
-        <w:t>Explainable AI &amp; Tools:</w:t>
-      </w:r>
-      <w:r>
-        <w:rPr>
-          <w:rFonts w:ascii="Calibri" w:hAnsi="Calibri"/>
-          <w:b w:val="0"/>
-          <w:color w:val="111827"/>
-          <w:sz w:val="17"/>
-        </w:rPr>
-        <w:t xml:space="preserve"> XAI (Token Attention, Interpretability), FastAPI, Flask, Pandas, NumPy, Data Preprocessing</w:t>
-      </w:r>
-    </w:p>
+    <w:tbl>
+      <w:tblPr>
+        <w:tblW w:type="auto" w:w="0"/>
+        <w:jc w:val="center"/>
+        <w:tblLook w:firstColumn="1" w:firstRow="1" w:lastColumn="0" w:lastRow="0" w:noHBand="0" w:noVBand="1" w:val="04A0"/>
+      </w:tblPr>
+      <w:tblGrid>
+        <w:gridCol w:w="7488"/>
+        <w:gridCol w:w="3312"/>
+      </w:tblGrid>
+      <w:tr>
+        <w:tc>
+          <w:tcPr>
+            <w:tcW w:type="dxa" w:w="5400"/>
+          </w:tcPr>
+          <w:p>
+            <w:pPr>
+              <w:spacing w:before="20" w:after="20"/>
+            </w:pPr>
+            <w:r>
+              <w:rPr>
+                <w:rFonts w:ascii="Calibri" w:hAnsi="Calibri"/>
+                <w:b/>
+                <w:color w:val="111827"/>
+                <w:sz w:val="17"/>
+              </w:rPr>
+              <w:t>Bachelor of Technology (B.Tech) - Computer Science &amp; Engineering (AI &amp; ML)</w:t>
+              <w:br/>
+            </w:r>
+            <w:r>
+              <w:rPr>
+                <w:rFonts w:ascii="Calibri" w:hAnsi="Calibri"/>
+                <w:b w:val="0"/>
+                <w:color w:val="374151"/>
+                <w:sz w:val="17"/>
+              </w:rPr>
+              <w:t>Malla Reddy University  |  Hyderabad, Telangana</w:t>
+            </w:r>
+          </w:p>
+        </w:tc>
+        <w:tc>
+          <w:tcPr>
+            <w:tcW w:type="dxa" w:w="5400"/>
+          </w:tcPr>
+          <w:p>
+            <w:pPr>
+              <w:spacing w:before="20" w:after="20"/>
+              <w:jc w:val="right"/>
+            </w:pPr>
+            <w:r>
+              <w:rPr>
+                <w:rFonts w:ascii="Calibri" w:hAnsi="Calibri"/>
+                <w:b/>
+                <w:color w:val="000000"/>
+                <w:sz w:val="17"/>
+              </w:rPr>
+              <w:t>2027</w:t>
+              <w:br/>
+            </w:r>
+            <w:r>
+              <w:rPr>
+                <w:rFonts w:ascii="Calibri" w:hAnsi="Calibri"/>
+                <w:b w:val="0"/>
+                <w:color w:val="374151"/>
+                <w:sz w:val="17"/>
+              </w:rPr>
+              <w:t>CGPA: 8.06 / 10 (till 3-2)</w:t>
+            </w:r>
+          </w:p>
+        </w:tc>
+      </w:tr>
+    </w:tbl>
+    <w:tbl>
+      <w:tblPr>
+        <w:tblW w:type="auto" w:w="0"/>
+        <w:jc w:val="center"/>
+        <w:tblLook w:firstColumn="1" w:firstRow="1" w:lastColumn="0" w:lastRow="0" w:noHBand="0" w:noVBand="1" w:val="04A0"/>
+      </w:tblPr>
+      <w:tblGrid>
+        <w:gridCol w:w="7488"/>
+        <w:gridCol w:w="3312"/>
+      </w:tblGrid>
+      <w:tr>
+        <w:tc>
+          <w:tcPr>
+            <w:tcW w:type="dxa" w:w="5400"/>
+          </w:tcPr>
+          <w:p>
+            <w:pPr>
+              <w:spacing w:before="20" w:after="20"/>
+            </w:pPr>
+            <w:r>
+              <w:rPr>
+                <w:rFonts w:ascii="Calibri" w:hAnsi="Calibri"/>
+                <w:b/>
+                <w:color w:val="111827"/>
+                <w:sz w:val="17"/>
+              </w:rPr>
+              <w:t>Intermediate (MPC - Mathematics, Physics, Chemistry)</w:t>
+              <w:br/>
+            </w:r>
+            <w:r>
+              <w:rPr>
+                <w:rFonts w:ascii="Calibri" w:hAnsi="Calibri"/>
+                <w:b w:val="0"/>
+                <w:color w:val="374151"/>
+                <w:sz w:val="17"/>
+              </w:rPr>
+              <w:t>Sri Chaitanya Junior College  |  Hyderabad, Telangana</w:t>
+            </w:r>
+          </w:p>
+        </w:tc>
+        <w:tc>
+          <w:tcPr>
+            <w:tcW w:type="dxa" w:w="5400"/>
+          </w:tcPr>
+          <w:p>
+            <w:pPr>
+              <w:spacing w:before="20" w:after="20"/>
+              <w:jc w:val="right"/>
+            </w:pPr>
+            <w:r>
+              <w:rPr>
+                <w:rFonts w:ascii="Calibri" w:hAnsi="Calibri"/>
+                <w:b/>
+                <w:color w:val="000000"/>
+                <w:sz w:val="17"/>
+              </w:rPr>
+              <w:t>2023</w:t>
+              <w:br/>
+            </w:r>
+            <w:r>
+              <w:rPr>
+                <w:rFonts w:ascii="Calibri" w:hAnsi="Calibri"/>
+                <w:b w:val="0"/>
+                <w:color w:val="374151"/>
+                <w:sz w:val="17"/>
+              </w:rPr>
+              <w:t>Score: 91.9%</w:t>
+            </w:r>
+          </w:p>
+        </w:tc>
+      </w:tr>
+    </w:tbl>
+    <w:tbl>
+      <w:tblPr>
+        <w:tblW w:type="auto" w:w="0"/>
+        <w:jc w:val="center"/>
+        <w:tblLook w:firstColumn="1" w:firstRow="1" w:lastColumn="0" w:lastRow="0" w:noHBand="0" w:noVBand="1" w:val="04A0"/>
+      </w:tblPr>
+      <w:tblGrid>
+        <w:gridCol w:w="7488"/>
+        <w:gridCol w:w="3312"/>
+      </w:tblGrid>
+      <w:tr>
+        <w:tc>
+          <w:tcPr>
+            <w:tcW w:type="dxa" w:w="5400"/>
+          </w:tcPr>
+          <w:p>
+            <w:pPr>
+              <w:spacing w:before="20" w:after="20"/>
+            </w:pPr>
+            <w:r>
+              <w:rPr>
+                <w:rFonts w:ascii="Calibri" w:hAnsi="Calibri"/>
+                <w:b/>
+                <w:color w:val="111827"/>
+                <w:sz w:val="17"/>
+              </w:rPr>
+              <w:t>Secondary School Certificate (SSC - 10th Class)</w:t>
+              <w:br/>
+            </w:r>
+            <w:r>
+              <w:rPr>
+                <w:rFonts w:ascii="Calibri" w:hAnsi="Calibri"/>
+                <w:b w:val="0"/>
+                <w:color w:val="374151"/>
+                <w:sz w:val="17"/>
+              </w:rPr>
+              <w:t>Chaitanya School  |  Jagtial, Telangana</w:t>
+            </w:r>
+          </w:p>
+        </w:tc>
+        <w:tc>
+          <w:tcPr>
+            <w:tcW w:type="dxa" w:w="5400"/>
+          </w:tcPr>
+          <w:p>
+            <w:pPr>
+              <w:spacing w:before="20" w:after="20"/>
+              <w:jc w:val="right"/>
+            </w:pPr>
+            <w:r>
+              <w:rPr>
+                <w:rFonts w:ascii="Calibri" w:hAnsi="Calibri"/>
+                <w:b/>
+                <w:color w:val="000000"/>
+                <w:sz w:val="17"/>
+              </w:rPr>
+              <w:t>2021</w:t>
+              <w:br/>
+            </w:r>
+            <w:r>
+              <w:rPr>
+                <w:rFonts w:ascii="Calibri" w:hAnsi="Calibri"/>
+                <w:b w:val="0"/>
+                <w:color w:val="374151"/>
+                <w:sz w:val="17"/>
+              </w:rPr>
+              <w:t>GPA: 9.8 / 10</w:t>
+            </w:r>
+          </w:p>
+        </w:tc>
+      </w:tr>
+    </w:tbl>
     <w:p>
       <w:pPr>
         <w:spacing w:before="100" w:after="40"/>
         <w:pBdr>
-          <w:bottom w:val="single" w:sz="6" w:space="1" w:color="111827"/>
+          <w:bottom w:val="single" w:sz="6" w:space="1" w:color="000000"/>
         </w:pBdr>
       </w:pPr>
       <w:r>
@@ -248,7 +372,7 @@
           <w:rFonts w:ascii="Calibri" w:hAnsi="Calibri"/>
           <w:b/>
           <w:color w:val="000000"/>
-          <w:sz w:val="19"/>
+          <w:sz w:val="20"/>
         </w:rPr>
         <w:t>PROFESSIONAL EXPERIENCE</w:t>
       </w:r>
@@ -451,7 +575,7 @@
       <w:pPr>
         <w:spacing w:before="100" w:after="40"/>
         <w:pBdr>
-          <w:bottom w:val="single" w:sz="6" w:space="1" w:color="111827"/>
+          <w:bottom w:val="single" w:sz="6" w:space="1" w:color="000000"/>
         </w:pBdr>
       </w:pPr>
       <w:r>
@@ -459,7 +583,7 @@
           <w:rFonts w:ascii="Calibri" w:hAnsi="Calibri"/>
           <w:b/>
           <w:color w:val="000000"/>
-          <w:sz w:val="19"/>
+          <w:sz w:val="20"/>
         </w:rPr>
         <w:t>KEY TECHNICAL PROJECTS</w:t>
       </w:r>
@@ -870,7 +994,7 @@
       <w:pPr>
         <w:spacing w:before="100" w:after="40"/>
         <w:pBdr>
-          <w:bottom w:val="single" w:sz="6" w:space="1" w:color="111827"/>
+          <w:bottom w:val="single" w:sz="6" w:space="1" w:color="000000"/>
         </w:pBdr>
       </w:pPr>
       <w:r>
@@ -878,227 +1002,103 @@
           <w:rFonts w:ascii="Calibri" w:hAnsi="Calibri"/>
           <w:b/>
           <w:color w:val="000000"/>
-          <w:sz w:val="19"/>
+          <w:sz w:val="20"/>
         </w:rPr>
-        <w:t>EDUCATION</w:t>
+        <w:t>TECHNICAL SKILLS</w:t>
       </w:r>
     </w:p>
-    <w:tbl>
-      <w:tblPr>
-        <w:tblW w:type="auto" w:w="0"/>
-        <w:jc w:val="center"/>
-        <w:tblLook w:firstColumn="1" w:firstRow="1" w:lastColumn="0" w:lastRow="0" w:noHBand="0" w:noVBand="1" w:val="04A0"/>
-      </w:tblPr>
-      <w:tblGrid>
-        <w:gridCol w:w="7488"/>
-        <w:gridCol w:w="3312"/>
-      </w:tblGrid>
-      <w:tr>
-        <w:tc>
-          <w:tcPr>
-            <w:tcW w:type="dxa" w:w="5400"/>
-          </w:tcPr>
-          <w:p>
-            <w:pPr>
-              <w:spacing w:before="20" w:after="20"/>
-            </w:pPr>
-            <w:r>
-              <w:rPr>
-                <w:rFonts w:ascii="Calibri" w:hAnsi="Calibri"/>
-                <w:b/>
-                <w:color w:val="111827"/>
-                <w:sz w:val="17"/>
-              </w:rPr>
-              <w:t>Bachelor of Technology (B.Tech) - Computer Science &amp; Engineering (AI &amp; ML)</w:t>
-              <w:br/>
-            </w:r>
-            <w:r>
-              <w:rPr>
-                <w:rFonts w:ascii="Calibri" w:hAnsi="Calibri"/>
-                <w:b w:val="0"/>
-                <w:color w:val="374151"/>
-                <w:sz w:val="17"/>
-              </w:rPr>
-              <w:t>Malla Reddy University  |  Hyderabad, Telangana</w:t>
-            </w:r>
-          </w:p>
-        </w:tc>
-        <w:tc>
-          <w:tcPr>
-            <w:tcW w:type="dxa" w:w="5400"/>
-          </w:tcPr>
-          <w:p>
-            <w:pPr>
-              <w:spacing w:before="20" w:after="20"/>
-              <w:jc w:val="right"/>
-            </w:pPr>
-            <w:r>
-              <w:rPr>
-                <w:rFonts w:ascii="Calibri" w:hAnsi="Calibri"/>
-                <w:b w:val="0"/>
-                <w:color w:val="374151"/>
-                <w:sz w:val="17"/>
-              </w:rPr>
-              <w:t>2027</w:t>
-              <w:br/>
-            </w:r>
-            <w:r>
-              <w:rPr>
-                <w:rFonts w:ascii="Calibri" w:hAnsi="Calibri"/>
-                <w:b w:val="0"/>
-                <w:color w:val="374151"/>
-                <w:sz w:val="17"/>
-              </w:rPr>
-              <w:t>CGPA: 8.06 / 10 (till 3-2)</w:t>
-            </w:r>
-          </w:p>
-        </w:tc>
-      </w:tr>
-    </w:tbl>
-    <w:tbl>
-      <w:tblPr>
-        <w:tblW w:type="auto" w:w="0"/>
-        <w:jc w:val="center"/>
-        <w:tblLook w:firstColumn="1" w:firstRow="1" w:lastColumn="0" w:lastRow="0" w:noHBand="0" w:noVBand="1" w:val="04A0"/>
-      </w:tblPr>
-      <w:tblGrid>
-        <w:gridCol w:w="7488"/>
-        <w:gridCol w:w="3312"/>
-      </w:tblGrid>
-      <w:tr>
-        <w:tc>
-          <w:tcPr>
-            <w:tcW w:type="dxa" w:w="5400"/>
-          </w:tcPr>
-          <w:p>
-            <w:pPr>
-              <w:spacing w:before="20" w:after="20"/>
-            </w:pPr>
-            <w:r>
-              <w:rPr>
-                <w:rFonts w:ascii="Calibri" w:hAnsi="Calibri"/>
-                <w:b/>
-                <w:color w:val="111827"/>
-                <w:sz w:val="17"/>
-              </w:rPr>
-              <w:t>Intermediate (MPC - Mathematics, Physics, Chemistry)</w:t>
-              <w:br/>
-            </w:r>
-            <w:r>
-              <w:rPr>
-                <w:rFonts w:ascii="Calibri" w:hAnsi="Calibri"/>
-                <w:b w:val="0"/>
-                <w:color w:val="374151"/>
-                <w:sz w:val="17"/>
-              </w:rPr>
-              <w:t>Sri Chaitanya Junior College  |  Hyderabad, Telangana</w:t>
-            </w:r>
-          </w:p>
-        </w:tc>
-        <w:tc>
-          <w:tcPr>
-            <w:tcW w:type="dxa" w:w="5400"/>
-          </w:tcPr>
-          <w:p>
-            <w:pPr>
-              <w:spacing w:before="20" w:after="20"/>
-              <w:jc w:val="right"/>
-            </w:pPr>
-            <w:r>
-              <w:rPr>
-                <w:rFonts w:ascii="Calibri" w:hAnsi="Calibri"/>
-                <w:b w:val="0"/>
-                <w:color w:val="374151"/>
-                <w:sz w:val="17"/>
-              </w:rPr>
-              <w:t>2023</w:t>
-              <w:br/>
-            </w:r>
-            <w:r>
-              <w:rPr>
-                <w:rFonts w:ascii="Calibri" w:hAnsi="Calibri"/>
-                <w:b w:val="0"/>
-                <w:color w:val="374151"/>
-                <w:sz w:val="17"/>
-              </w:rPr>
-              <w:t>Score: 91.9%</w:t>
-            </w:r>
-          </w:p>
-        </w:tc>
-      </w:tr>
-    </w:tbl>
-    <w:tbl>
-      <w:tblPr>
-        <w:tblW w:type="auto" w:w="0"/>
-        <w:jc w:val="center"/>
-        <w:tblLook w:firstColumn="1" w:firstRow="1" w:lastColumn="0" w:lastRow="0" w:noHBand="0" w:noVBand="1" w:val="04A0"/>
-      </w:tblPr>
-      <w:tblGrid>
-        <w:gridCol w:w="7488"/>
-        <w:gridCol w:w="3312"/>
-      </w:tblGrid>
-      <w:tr>
-        <w:tc>
-          <w:tcPr>
-            <w:tcW w:type="dxa" w:w="5400"/>
-          </w:tcPr>
-          <w:p>
-            <w:pPr>
-              <w:spacing w:before="20" w:after="20"/>
-            </w:pPr>
-            <w:r>
-              <w:rPr>
-                <w:rFonts w:ascii="Calibri" w:hAnsi="Calibri"/>
-                <w:b/>
-                <w:color w:val="111827"/>
-                <w:sz w:val="17"/>
-              </w:rPr>
-              <w:t>Secondary School Certificate (SSC - 10th Class)</w:t>
-              <w:br/>
-            </w:r>
-            <w:r>
-              <w:rPr>
-                <w:rFonts w:ascii="Calibri" w:hAnsi="Calibri"/>
-                <w:b w:val="0"/>
-                <w:color w:val="374151"/>
-                <w:sz w:val="17"/>
-              </w:rPr>
-              <w:t>Chaitanya School  |  Jagtial, Telangana</w:t>
-            </w:r>
-          </w:p>
-        </w:tc>
-        <w:tc>
-          <w:tcPr>
-            <w:tcW w:type="dxa" w:w="5400"/>
-          </w:tcPr>
-          <w:p>
-            <w:pPr>
-              <w:spacing w:before="20" w:after="20"/>
-              <w:jc w:val="right"/>
-            </w:pPr>
-            <w:r>
-              <w:rPr>
-                <w:rFonts w:ascii="Calibri" w:hAnsi="Calibri"/>
-                <w:b w:val="0"/>
-                <w:color w:val="374151"/>
-                <w:sz w:val="17"/>
-              </w:rPr>
-              <w:t>2021</w:t>
-              <w:br/>
-            </w:r>
-            <w:r>
-              <w:rPr>
-                <w:rFonts w:ascii="Calibri" w:hAnsi="Calibri"/>
-                <w:b w:val="0"/>
-                <w:color w:val="374151"/>
-                <w:sz w:val="17"/>
-              </w:rPr>
-              <w:t>GPA: 9.8 / 10</w:t>
-            </w:r>
-          </w:p>
-        </w:tc>
-      </w:tr>
-    </w:tbl>
+    <w:p>
+      <w:pPr>
+        <w:spacing w:before="0" w:after="20"/>
+      </w:pPr>
+      <w:r>
+        <w:rPr>
+          <w:rFonts w:ascii="Calibri" w:hAnsi="Calibri"/>
+          <w:b/>
+          <w:color w:val="000000"/>
+          <w:sz w:val="17"/>
+        </w:rPr>
+        <w:t>Languages &amp; Core:</w:t>
+      </w:r>
+      <w:r>
+        <w:rPr>
+          <w:rFonts w:ascii="Calibri" w:hAnsi="Calibri"/>
+          <w:b w:val="0"/>
+          <w:color w:val="111827"/>
+          <w:sz w:val="17"/>
+        </w:rPr>
+        <w:t xml:space="preserve"> Python, Java, C/C++, SQL, Git, GitHub, RESTful APIs</w:t>
+      </w:r>
+    </w:p>
+    <w:p>
+      <w:pPr>
+        <w:spacing w:before="0" w:after="20"/>
+      </w:pPr>
+      <w:r>
+        <w:rPr>
+          <w:rFonts w:ascii="Calibri" w:hAnsi="Calibri"/>
+          <w:b/>
+          <w:color w:val="000000"/>
+          <w:sz w:val="17"/>
+        </w:rPr>
+        <w:t>Machine Learning &amp; DL:</w:t>
+      </w:r>
+      <w:r>
+        <w:rPr>
+          <w:rFonts w:ascii="Calibri" w:hAnsi="Calibri"/>
+          <w:b w:val="0"/>
+          <w:color w:val="111827"/>
+          <w:sz w:val="17"/>
+        </w:rPr>
+        <w:t xml:space="preserve"> PyTorch, TensorFlow, Keras, Scikit-Learn, BiLSTM, 1D-CNN, Ensembles, Predictive Analytics</w:t>
+      </w:r>
+    </w:p>
+    <w:p>
+      <w:pPr>
+        <w:spacing w:before="0" w:after="20"/>
+      </w:pPr>
+      <w:r>
+        <w:rPr>
+          <w:rFonts w:ascii="Calibri" w:hAnsi="Calibri"/>
+          <w:b/>
+          <w:color w:val="000000"/>
+          <w:sz w:val="17"/>
+        </w:rPr>
+        <w:t>NLP &amp; Text Forensics:</w:t>
+      </w:r>
+      <w:r>
+        <w:rPr>
+          <w:rFonts w:ascii="Calibri" w:hAnsi="Calibri"/>
+          <w:b w:val="0"/>
+          <w:color w:val="111827"/>
+          <w:sz w:val="17"/>
+        </w:rPr>
+        <w:t xml:space="preserve"> NLTK, TF-IDF, Tokenization, Lemmatization, Sentiment Analysis, Text Mining, Keyword Extraction</w:t>
+      </w:r>
+    </w:p>
+    <w:p>
+      <w:pPr>
+        <w:spacing w:before="0" w:after="20"/>
+      </w:pPr>
+      <w:r>
+        <w:rPr>
+          <w:rFonts w:ascii="Calibri" w:hAnsi="Calibri"/>
+          <w:b/>
+          <w:color w:val="000000"/>
+          <w:sz w:val="17"/>
+        </w:rPr>
+        <w:t>Explainable AI &amp; Tools:</w:t>
+      </w:r>
+      <w:r>
+        <w:rPr>
+          <w:rFonts w:ascii="Calibri" w:hAnsi="Calibri"/>
+          <w:b w:val="0"/>
+          <w:color w:val="111827"/>
+          <w:sz w:val="17"/>
+        </w:rPr>
+        <w:t xml:space="preserve"> XAI (Token Attention, Interpretability), FastAPI, Flask, Pandas, NumPy, Data Preprocessing</w:t>
+      </w:r>
+    </w:p>
     <w:sectPr>
       <w:pgSz w:w="12240" w:h="15840"/>
       <w:pgMar w:top="576" w:right="720" w:bottom="576" w:left="720" w:header="720" w:footer="720" w:gutter="0"/>

</xml_diff>

<commit_message>
Update resume: bold black B.Tech & skill headings, remove Intermediate & 10th class
</commit_message>
<xml_diff>
--- a/Sricharan_Surakanti_Resume.docx
+++ b/Sricharan_Surakanti_Resume.docx
@@ -167,7 +167,7 @@
               <w:rPr>
                 <w:rFonts w:ascii="Calibri" w:hAnsi="Calibri"/>
                 <w:b/>
-                <w:color w:val="111827"/>
+                <w:color w:val="000000"/>
                 <w:sz w:val="17"/>
               </w:rPr>
               <w:t>Bachelor of Technology (B.Tech) - Computer Science &amp; Engineering (AI &amp; ML)</w:t>
@@ -211,150 +211,6 @@
                 <w:sz w:val="17"/>
               </w:rPr>
               <w:t>CGPA: 8.06 / 10 (till 3-2)</w:t>
-            </w:r>
-          </w:p>
-        </w:tc>
-      </w:tr>
-    </w:tbl>
-    <w:tbl>
-      <w:tblPr>
-        <w:tblW w:type="auto" w:w="0"/>
-        <w:jc w:val="center"/>
-        <w:tblLook w:firstColumn="1" w:firstRow="1" w:lastColumn="0" w:lastRow="0" w:noHBand="0" w:noVBand="1" w:val="04A0"/>
-      </w:tblPr>
-      <w:tblGrid>
-        <w:gridCol w:w="7488"/>
-        <w:gridCol w:w="3312"/>
-      </w:tblGrid>
-      <w:tr>
-        <w:tc>
-          <w:tcPr>
-            <w:tcW w:type="dxa" w:w="5400"/>
-          </w:tcPr>
-          <w:p>
-            <w:pPr>
-              <w:spacing w:before="20" w:after="20"/>
-            </w:pPr>
-            <w:r>
-              <w:rPr>
-                <w:rFonts w:ascii="Calibri" w:hAnsi="Calibri"/>
-                <w:b/>
-                <w:color w:val="111827"/>
-                <w:sz w:val="17"/>
-              </w:rPr>
-              <w:t>Intermediate (MPC - Mathematics, Physics, Chemistry)</w:t>
-              <w:br/>
-            </w:r>
-            <w:r>
-              <w:rPr>
-                <w:rFonts w:ascii="Calibri" w:hAnsi="Calibri"/>
-                <w:b w:val="0"/>
-                <w:color w:val="374151"/>
-                <w:sz w:val="17"/>
-              </w:rPr>
-              <w:t>Sri Chaitanya Junior College  |  Hyderabad, Telangana</w:t>
-            </w:r>
-          </w:p>
-        </w:tc>
-        <w:tc>
-          <w:tcPr>
-            <w:tcW w:type="dxa" w:w="5400"/>
-          </w:tcPr>
-          <w:p>
-            <w:pPr>
-              <w:spacing w:before="20" w:after="20"/>
-              <w:jc w:val="right"/>
-            </w:pPr>
-            <w:r>
-              <w:rPr>
-                <w:rFonts w:ascii="Calibri" w:hAnsi="Calibri"/>
-                <w:b/>
-                <w:color w:val="000000"/>
-                <w:sz w:val="17"/>
-              </w:rPr>
-              <w:t>2023</w:t>
-              <w:br/>
-            </w:r>
-            <w:r>
-              <w:rPr>
-                <w:rFonts w:ascii="Calibri" w:hAnsi="Calibri"/>
-                <w:b w:val="0"/>
-                <w:color w:val="374151"/>
-                <w:sz w:val="17"/>
-              </w:rPr>
-              <w:t>Score: 91.9%</w:t>
-            </w:r>
-          </w:p>
-        </w:tc>
-      </w:tr>
-    </w:tbl>
-    <w:tbl>
-      <w:tblPr>
-        <w:tblW w:type="auto" w:w="0"/>
-        <w:jc w:val="center"/>
-        <w:tblLook w:firstColumn="1" w:firstRow="1" w:lastColumn="0" w:lastRow="0" w:noHBand="0" w:noVBand="1" w:val="04A0"/>
-      </w:tblPr>
-      <w:tblGrid>
-        <w:gridCol w:w="7488"/>
-        <w:gridCol w:w="3312"/>
-      </w:tblGrid>
-      <w:tr>
-        <w:tc>
-          <w:tcPr>
-            <w:tcW w:type="dxa" w:w="5400"/>
-          </w:tcPr>
-          <w:p>
-            <w:pPr>
-              <w:spacing w:before="20" w:after="20"/>
-            </w:pPr>
-            <w:r>
-              <w:rPr>
-                <w:rFonts w:ascii="Calibri" w:hAnsi="Calibri"/>
-                <w:b/>
-                <w:color w:val="111827"/>
-                <w:sz w:val="17"/>
-              </w:rPr>
-              <w:t>Secondary School Certificate (SSC - 10th Class)</w:t>
-              <w:br/>
-            </w:r>
-            <w:r>
-              <w:rPr>
-                <w:rFonts w:ascii="Calibri" w:hAnsi="Calibri"/>
-                <w:b w:val="0"/>
-                <w:color w:val="374151"/>
-                <w:sz w:val="17"/>
-              </w:rPr>
-              <w:t>Chaitanya School  |  Jagtial, Telangana</w:t>
-            </w:r>
-          </w:p>
-        </w:tc>
-        <w:tc>
-          <w:tcPr>
-            <w:tcW w:type="dxa" w:w="5400"/>
-          </w:tcPr>
-          <w:p>
-            <w:pPr>
-              <w:spacing w:before="20" w:after="20"/>
-              <w:jc w:val="right"/>
-            </w:pPr>
-            <w:r>
-              <w:rPr>
-                <w:rFonts w:ascii="Calibri" w:hAnsi="Calibri"/>
-                <w:b/>
-                <w:color w:val="000000"/>
-                <w:sz w:val="17"/>
-              </w:rPr>
-              <w:t>2021</w:t>
-              <w:br/>
-            </w:r>
-            <w:r>
-              <w:rPr>
-                <w:rFonts w:ascii="Calibri" w:hAnsi="Calibri"/>
-                <w:b w:val="0"/>
-                <w:color w:val="374151"/>
-                <w:sz w:val="17"/>
-              </w:rPr>
-              <w:t>GPA: 9.8 / 10</w:t>
             </w:r>
           </w:p>
         </w:tc>

</xml_diff>

<commit_message>
Optimize vertical line spacing to fill page completely without extra text
</commit_message>
<xml_diff>
--- a/Sricharan_Surakanti_Resume.docx
+++ b/Sricharan_Surakanti_Resume.docx
@@ -98,7 +98,7 @@
     </w:p>
     <w:p>
       <w:pPr>
-        <w:spacing w:before="100" w:after="40"/>
+        <w:spacing w:before="140" w:after="50"/>
         <w:pBdr>
           <w:bottom w:val="single" w:sz="6" w:space="1" w:color="000000"/>
         </w:pBdr>
@@ -115,21 +115,21 @@
     </w:p>
     <w:p>
       <w:pPr>
-        <w:spacing w:before="40" w:after="80"/>
+        <w:spacing w:before="40" w:after="90"/>
       </w:pPr>
       <w:r>
         <w:rPr>
           <w:rFonts w:ascii="Calibri" w:hAnsi="Calibri"/>
           <w:b w:val="0"/>
           <w:color w:val="111827"/>
-          <w:sz w:val="17"/>
+          <w:sz w:val="18"/>
         </w:rPr>
         <w:t>Results-driven AI &amp; NLP Engineer with hands-on experience developing and deploying end-to-end Deep Learning architectures, Explainable AI (XAI) frameworks, and intelligent automation systems. Proficient in PyTorch, TensorFlow, FastAPI, and NLP pipelines (BiLSTM, 1D-CNN, TF-IDF). Demonstrated track record of translating machine learning research into production-ready microservices, achieving up to 96.2% classification accuracy and reducing service response latency.</w:t>
       </w:r>
     </w:p>
     <w:p>
       <w:pPr>
-        <w:spacing w:before="100" w:after="40"/>
+        <w:spacing w:before="140" w:after="50"/>
         <w:pBdr>
           <w:bottom w:val="single" w:sz="6" w:space="1" w:color="000000"/>
         </w:pBdr>
@@ -168,7 +168,7 @@
                 <w:rFonts w:ascii="Calibri" w:hAnsi="Calibri"/>
                 <w:b/>
                 <w:color w:val="000000"/>
-                <w:sz w:val="17"/>
+                <w:sz w:val="18"/>
               </w:rPr>
               <w:t>Bachelor of Technology (B.Tech) - Computer Science &amp; Engineering (AI &amp; ML)</w:t>
               <w:br/>
@@ -218,7 +218,7 @@
     </w:tbl>
     <w:p>
       <w:pPr>
-        <w:spacing w:before="100" w:after="40"/>
+        <w:spacing w:before="140" w:after="50"/>
         <w:pBdr>
           <w:bottom w:val="single" w:sz="6" w:space="1" w:color="000000"/>
         </w:pBdr>
@@ -288,7 +288,7 @@
     <w:p>
       <w:pPr>
         <w:pStyle w:val="ListBullet"/>
-        <w:spacing w:before="0" w:after="20"/>
+        <w:spacing w:before="0" w:after="36"/>
       </w:pPr>
       <w:r>
         <w:rPr>
@@ -303,7 +303,7 @@
     <w:p>
       <w:pPr>
         <w:pStyle w:val="ListBullet"/>
-        <w:spacing w:before="0" w:after="20"/>
+        <w:spacing w:before="0" w:after="36"/>
       </w:pPr>
       <w:r>
         <w:rPr>
@@ -318,7 +318,7 @@
     <w:p>
       <w:pPr>
         <w:pStyle w:val="ListBullet"/>
-        <w:spacing w:before="0" w:after="20"/>
+        <w:spacing w:before="0" w:after="36"/>
       </w:pPr>
       <w:r>
         <w:rPr>
@@ -385,7 +385,7 @@
     <w:p>
       <w:pPr>
         <w:pStyle w:val="ListBullet"/>
-        <w:spacing w:before="0" w:after="20"/>
+        <w:spacing w:before="0" w:after="36"/>
       </w:pPr>
       <w:r>
         <w:rPr>
@@ -400,7 +400,7 @@
     <w:p>
       <w:pPr>
         <w:pStyle w:val="ListBullet"/>
-        <w:spacing w:before="0" w:after="20"/>
+        <w:spacing w:before="0" w:after="36"/>
       </w:pPr>
       <w:r>
         <w:rPr>
@@ -415,7 +415,7 @@
     <w:p>
       <w:pPr>
         <w:pStyle w:val="ListBullet"/>
-        <w:spacing w:before="0" w:after="20"/>
+        <w:spacing w:before="0" w:after="36"/>
       </w:pPr>
       <w:r>
         <w:rPr>
@@ -429,7 +429,7 @@
     </w:p>
     <w:p>
       <w:pPr>
-        <w:spacing w:before="100" w:after="40"/>
+        <w:spacing w:before="140" w:after="50"/>
         <w:pBdr>
           <w:bottom w:val="single" w:sz="6" w:space="1" w:color="000000"/>
         </w:pBdr>
@@ -546,7 +546,7 @@
     <w:p>
       <w:pPr>
         <w:pStyle w:val="ListBullet"/>
-        <w:spacing w:before="0" w:after="20"/>
+        <w:spacing w:before="0" w:after="36"/>
       </w:pPr>
       <w:r>
         <w:rPr>
@@ -561,7 +561,7 @@
     <w:p>
       <w:pPr>
         <w:pStyle w:val="ListBullet"/>
-        <w:spacing w:before="0" w:after="20"/>
+        <w:spacing w:before="0" w:after="36"/>
       </w:pPr>
       <w:r>
         <w:rPr>
@@ -576,7 +576,7 @@
     <w:p>
       <w:pPr>
         <w:pStyle w:val="ListBullet"/>
-        <w:spacing w:before="0" w:after="20"/>
+        <w:spacing w:before="0" w:after="36"/>
       </w:pPr>
       <w:r>
         <w:rPr>
@@ -690,7 +690,7 @@
     <w:p>
       <w:pPr>
         <w:pStyle w:val="ListBullet"/>
-        <w:spacing w:before="0" w:after="20"/>
+        <w:spacing w:before="0" w:after="36"/>
       </w:pPr>
       <w:r>
         <w:rPr>
@@ -705,7 +705,7 @@
     <w:p>
       <w:pPr>
         <w:pStyle w:val="ListBullet"/>
-        <w:spacing w:before="0" w:after="20"/>
+        <w:spacing w:before="0" w:after="36"/>
       </w:pPr>
       <w:r>
         <w:rPr>
@@ -819,7 +819,7 @@
     <w:p>
       <w:pPr>
         <w:pStyle w:val="ListBullet"/>
-        <w:spacing w:before="0" w:after="20"/>
+        <w:spacing w:before="0" w:after="36"/>
       </w:pPr>
       <w:r>
         <w:rPr>
@@ -834,7 +834,7 @@
     <w:p>
       <w:pPr>
         <w:pStyle w:val="ListBullet"/>
-        <w:spacing w:before="0" w:after="20"/>
+        <w:spacing w:before="0" w:after="36"/>
       </w:pPr>
       <w:r>
         <w:rPr>
@@ -848,7 +848,7 @@
     </w:p>
     <w:p>
       <w:pPr>
-        <w:spacing w:before="100" w:after="40"/>
+        <w:spacing w:before="140" w:after="50"/>
         <w:pBdr>
           <w:bottom w:val="single" w:sz="6" w:space="1" w:color="000000"/>
         </w:pBdr>
@@ -865,7 +865,7 @@
     </w:p>
     <w:p>
       <w:pPr>
-        <w:spacing w:before="0" w:after="20"/>
+        <w:spacing w:before="0" w:after="40"/>
       </w:pPr>
       <w:r>
         <w:rPr>
@@ -888,7 +888,7 @@
     </w:p>
     <w:p>
       <w:pPr>
-        <w:spacing w:before="0" w:after="20"/>
+        <w:spacing w:before="0" w:after="40"/>
       </w:pPr>
       <w:r>
         <w:rPr>
@@ -911,7 +911,7 @@
     </w:p>
     <w:p>
       <w:pPr>
-        <w:spacing w:before="0" w:after="20"/>
+        <w:spacing w:before="0" w:after="40"/>
       </w:pPr>
       <w:r>
         <w:rPr>
@@ -934,7 +934,7 @@
     </w:p>
     <w:p>
       <w:pPr>
-        <w:spacing w:before="0" w:after="20"/>
+        <w:spacing w:before="0" w:after="40"/>
       </w:pPr>
       <w:r>
         <w:rPr>

</xml_diff>

<commit_message>
Add explicit Live Deployment hyperlinks in Resume and Portfolio
</commit_message>
<xml_diff>
--- a/Sricharan_Surakanti_Resume.docx
+++ b/Sricharan_Surakanti_Resume.docx
@@ -19,7 +19,7 @@
     </w:p>
     <w:p>
       <w:pPr>
-        <w:spacing w:before="0" w:after="20"/>
+        <w:spacing w:before="0" w:after="80"/>
         <w:jc w:val="center"/>
       </w:pPr>
       <w:r>
@@ -41,12 +41,15 @@
           <w:t>surakantisricharan8@gmail.com</w:t>
         </w:r>
       </w:hyperlink>
-    </w:p>
-    <w:p>
-      <w:pPr>
-        <w:spacing w:before="0" w:after="80"/>
-        <w:jc w:val="center"/>
-      </w:pPr>
+      <w:r>
+        <w:rPr>
+          <w:rFonts w:ascii="Calibri" w:hAnsi="Calibri"/>
+          <w:b w:val="0"/>
+          <w:color w:val="374151"/>
+          <w:sz w:val="17"/>
+        </w:rPr>
+        <w:t xml:space="preserve">  •  </w:t>
+      </w:r>
       <w:hyperlink r:id="rId10">
         <w:r>
           <w:rPr>
@@ -54,7 +57,7 @@
             <w:color w:val="0A66C2"/>
             <w:u w:val="single"/>
           </w:rPr>
-          <w:t>Portfolio: surakantisricharan.github.io/my-portfolio</w:t>
+          <w:t>Portfolio</w:t>
         </w:r>
       </w:hyperlink>
       <w:r>
@@ -73,7 +76,7 @@
             <w:color w:val="0A66C2"/>
             <w:u w:val="single"/>
           </w:rPr>
-          <w:t>linkedin.com/in/sricharan-surakanti</w:t>
+          <w:t>GitHub</w:t>
         </w:r>
       </w:hyperlink>
       <w:r>
@@ -92,7 +95,7 @@
             <w:color w:val="0A66C2"/>
             <w:u w:val="single"/>
           </w:rPr>
-          <w:t>github.com/SurakantiSricharan</w:t>
+          <w:t>LinkedIn</w:t>
         </w:r>
       </w:hyperlink>
     </w:p>
@@ -507,7 +510,7 @@
                   <w:color w:val="0A66C2"/>
                   <w:u w:val="single"/>
                 </w:rPr>
-                <w:t>Live Demo</w:t>
+                <w:t>Live Deployment</w:t>
               </w:r>
             </w:hyperlink>
             <w:r>
@@ -651,7 +654,7 @@
                   <w:color w:val="0A66C2"/>
                   <w:u w:val="single"/>
                 </w:rPr>
-                <w:t>Live Demo</w:t>
+                <w:t>Live Deployment</w:t>
               </w:r>
             </w:hyperlink>
             <w:r>
@@ -780,7 +783,7 @@
                   <w:color w:val="0A66C2"/>
                   <w:u w:val="single"/>
                 </w:rPr>
-                <w:t>Live Demo</w:t>
+                <w:t>Live Deployment</w:t>
               </w:r>
             </w:hyperlink>
             <w:r>

</xml_diff>

<commit_message>
Configure all external, project, and resume links to open in a new tab
</commit_message>
<xml_diff>
--- a/Sricharan_Surakanti_Resume.docx
+++ b/Sricharan_Surakanti_Resume.docx
@@ -31,7 +31,7 @@
         </w:rPr>
         <w:t xml:space="preserve">Hyderabad, Telangana, India  •  +91 7032511447  •  </w:t>
       </w:r>
-      <w:hyperlink r:id="rId9">
+      <w:hyperlink r:id="rId9" w:tgtFrame="_blank">
         <w:r>
           <w:rPr>
             <w:rFonts w:ascii="Calibri" w:hAnsi="Calibri"/>
@@ -50,7 +50,7 @@
         </w:rPr>
         <w:t xml:space="preserve">  •  </w:t>
       </w:r>
-      <w:hyperlink r:id="rId10">
+      <w:hyperlink r:id="rId10" w:tgtFrame="_blank">
         <w:r>
           <w:rPr>
             <w:rFonts w:ascii="Calibri" w:hAnsi="Calibri"/>
@@ -69,7 +69,7 @@
         </w:rPr>
         <w:t xml:space="preserve">  •  </w:t>
       </w:r>
-      <w:hyperlink r:id="rId11">
+      <w:hyperlink r:id="rId11" w:tgtFrame="_blank">
         <w:r>
           <w:rPr>
             <w:rFonts w:ascii="Calibri" w:hAnsi="Calibri"/>
@@ -88,7 +88,7 @@
         </w:rPr>
         <w:t xml:space="preserve">  •  </w:t>
       </w:r>
-      <w:hyperlink r:id="rId12">
+      <w:hyperlink r:id="rId12" w:tgtFrame="_blank">
         <w:r>
           <w:rPr>
             <w:rFonts w:ascii="Calibri" w:hAnsi="Calibri"/>
@@ -484,7 +484,7 @@
               </w:rPr>
               <w:t>[</w:t>
             </w:r>
-            <w:hyperlink r:id="rId13">
+            <w:hyperlink r:id="rId13" w:tgtFrame="_blank">
               <w:r>
                 <w:rPr>
                   <w:rFonts w:ascii="Calibri" w:hAnsi="Calibri"/>
@@ -503,7 +503,7 @@
               </w:rPr>
               <w:t>]  [</w:t>
             </w:r>
-            <w:hyperlink r:id="rId14">
+            <w:hyperlink r:id="rId14" w:tgtFrame="_blank">
               <w:r>
                 <w:rPr>
                   <w:rFonts w:ascii="Calibri" w:hAnsi="Calibri"/>
@@ -628,7 +628,7 @@
               </w:rPr>
               <w:t>[</w:t>
             </w:r>
-            <w:hyperlink r:id="rId15">
+            <w:hyperlink r:id="rId15" w:tgtFrame="_blank">
               <w:r>
                 <w:rPr>
                   <w:rFonts w:ascii="Calibri" w:hAnsi="Calibri"/>
@@ -647,7 +647,7 @@
               </w:rPr>
               <w:t>]  [</w:t>
             </w:r>
-            <w:hyperlink r:id="rId16">
+            <w:hyperlink r:id="rId16" w:tgtFrame="_blank">
               <w:r>
                 <w:rPr>
                   <w:rFonts w:ascii="Calibri" w:hAnsi="Calibri"/>
@@ -757,7 +757,7 @@
               </w:rPr>
               <w:t>[</w:t>
             </w:r>
-            <w:hyperlink r:id="rId17">
+            <w:hyperlink r:id="rId17" w:tgtFrame="_blank">
               <w:r>
                 <w:rPr>
                   <w:rFonts w:ascii="Calibri" w:hAnsi="Calibri"/>
@@ -776,7 +776,7 @@
               </w:rPr>
               <w:t>]  [</w:t>
             </w:r>
-            <w:hyperlink r:id="rId18">
+            <w:hyperlink r:id="rId18" w:tgtFrame="_blank">
               <w:r>
                 <w:rPr>
                   <w:rFonts w:ascii="Calibri" w:hAnsi="Calibri"/>

</xml_diff>

<commit_message>
Add Resume PDF button beside LinkedIn and GitHub icons across all pages and refine education ATS format
</commit_message>
<xml_diff>
--- a/Sricharan_Surakanti_Resume.docx
+++ b/Sricharan_Surakanti_Resume.docx
@@ -203,7 +203,7 @@
                 <w:color w:val="000000"/>
                 <w:sz w:val="17"/>
               </w:rPr>
-              <w:t>2027</w:t>
+              <w:t>Expected May 2027</w:t>
               <w:br/>
             </w:r>
             <w:r>
@@ -213,7 +213,7 @@
                 <w:color w:val="374151"/>
                 <w:sz w:val="17"/>
               </w:rPr>
-              <w:t>CGPA: 8.06 / 10 (till 3-2)</w:t>
+              <w:t>CGPA: 8.06 / 10.0</w:t>
             </w:r>
           </w:p>
         </w:tc>

</xml_diff>